<commit_message>
Sesión 1: escalón del convertidor q = Vcc/2ᴺ, como en el resto del curso
El cuaderno de S1 calculaba la cuenta con V/Vcc × 1023 (convención de Arduino) y S2 usa
escalón = rango/2ᴺ. Ahora S1 usa q = Vcc/2¹⁰ = 4.883 mV, cuenta = ROUND(V/q) con tope en 1023
y la reconstrucción V = cuenta × q. La cuenta del ejercicio 3 no cambia en la práctica
(diferencia de 0.1 %); el texto del cuaderno y la ecuación del proyecto integrador se ajustan.
prueba_cuadernos.py 1: 12/12, en blanco se detiene bien, 6 CSV del profesor sin problemas.

Co-Authored-By: Claude Opus 5.5 <noreply@anthropic.com>
Claude-Session: https://claude.ai/code/session_01VG3vBwk14WmQvABR553jEZ
</commit_message>
<xml_diff>
--- a/proyecto_integrador/F_Proyecto_integrador_DAQ_2027_GGT.docx
+++ b/proyecto_integrador/F_Proyecto_integrador_DAQ_2027_GGT.docx
@@ -1316,28 +1316,7 @@
                 <w:color w:val="1A1A1A"/>
                 <w:sz w:val="21"/>
               </w:rPr>
-              <w:t>N = ROUND(V/Vcc·N</w:t>
-            </w:r>
-            <w:r>
-              <w:rPr>
-                <w:rFonts w:ascii="Arial" w:hAnsi="Arial" w:eastAsia="Arial"/>
-                <w:b/>
-                <w:i w:val="0"/>
-                <w:color w:val="1A1A1A"/>
-                <w:sz w:val="17"/>
-                <w:vertAlign w:val="subscript"/>
-              </w:rPr>
-              <w:t>max</w:t>
-            </w:r>
-            <w:r>
-              <w:rPr>
-                <w:rFonts w:ascii="Arial" w:hAnsi="Arial" w:eastAsia="Arial"/>
-                <w:b/>
-                <w:i w:val="0"/>
-                <w:color w:val="1A1A1A"/>
-                <w:sz w:val="21"/>
-              </w:rPr>
-              <w:t>)</w:t>
+              <w:t>N = ROUND(V/q), q = Vcc/2ᴺ</w:t>
             </w:r>
           </w:p>
           <w:p>

</xml_diff>